<commit_message>
Finalize Lab 1 deliverables
</commit_message>
<xml_diff>
--- a/Lab1/requirements.docx
+++ b/Lab1/requirements.docx
@@ -8,7 +8,7 @@
           <w:rFonts w:ascii="Segoe UI" w:hAnsi="Segoe UI"/>
           <w:b/>
           <w:color w:val="1A73E8"/>
-          <w:sz w:val="44"/>
+          <w:sz w:val="40"/>
         </w:rPr>
         <w:t>Peer-to-Peer Carpooling &amp; Expense Splitter</w:t>
       </w:r>
@@ -19,7 +19,7 @@
           <w:rFonts w:ascii="Segoe UI" w:hAnsi="Segoe UI"/>
           <w:b/>
           <w:color w:val="137333"/>
-          <w:sz w:val="28"/>
+          <w:sz w:val="26"/>
         </w:rPr>
         <w:t>Software Requirements Specification (SRS) - Lab 1</w:t>
       </w:r>
@@ -53,7 +53,7 @@
         <w:rPr>
           <w:color w:val="1A73E8"/>
         </w:rPr>
-        <w:t>1. Requirements Summary Table</w:t>
+        <w:t>Requirements Summary Table</w:t>
       </w:r>
     </w:p>
     <w:tbl>
@@ -64,17 +64,17 @@
         <w:tblLook w:firstColumn="1" w:firstRow="1" w:lastColumn="0" w:lastRow="0" w:noHBand="0" w:noVBand="1" w:val="04A0"/>
       </w:tblPr>
       <w:tblGrid>
-        <w:gridCol w:w="1560"/>
-        <w:gridCol w:w="1560"/>
-        <w:gridCol w:w="1560"/>
-        <w:gridCol w:w="1560"/>
-        <w:gridCol w:w="1560"/>
-        <w:gridCol w:w="1560"/>
+        <w:gridCol w:w="1656"/>
+        <w:gridCol w:w="1656"/>
+        <w:gridCol w:w="1656"/>
+        <w:gridCol w:w="1656"/>
+        <w:gridCol w:w="1656"/>
+        <w:gridCol w:w="1656"/>
       </w:tblGrid>
       <w:tr>
         <w:tc>
           <w:tcPr>
-            <w:tcW w:type="dxa" w:w="1560"/>
+            <w:tcW w:type="dxa" w:w="1656"/>
             <w:shd w:fill="E8F0FE"/>
           </w:tcPr>
           <w:p>
@@ -86,15 +86,15 @@
                 <w:rFonts w:ascii="Segoe UI" w:hAnsi="Segoe UI"/>
                 <w:b/>
                 <w:color w:val="1A73E8"/>
-                <w:sz w:val="20"/>
+                <w:sz w:val="19"/>
               </w:rPr>
-              <w:t>ID</w:t>
+              <w:t>Req ID</w:t>
             </w:r>
           </w:p>
         </w:tc>
         <w:tc>
           <w:tcPr>
-            <w:tcW w:type="dxa" w:w="1560"/>
+            <w:tcW w:type="dxa" w:w="1656"/>
             <w:shd w:fill="E8F0FE"/>
           </w:tcPr>
           <w:p>
@@ -106,7 +106,7 @@
                 <w:rFonts w:ascii="Segoe UI" w:hAnsi="Segoe UI"/>
                 <w:b/>
                 <w:color w:val="1A73E8"/>
-                <w:sz w:val="20"/>
+                <w:sz w:val="19"/>
               </w:rPr>
               <w:t>Type</w:t>
             </w:r>
@@ -114,7 +114,7 @@
         </w:tc>
         <w:tc>
           <w:tcPr>
-            <w:tcW w:type="dxa" w:w="1560"/>
+            <w:tcW w:type="dxa" w:w="1656"/>
             <w:shd w:fill="E8F0FE"/>
           </w:tcPr>
           <w:p>
@@ -126,7 +126,7 @@
                 <w:rFonts w:ascii="Segoe UI" w:hAnsi="Segoe UI"/>
                 <w:b/>
                 <w:color w:val="1A73E8"/>
-                <w:sz w:val="20"/>
+                <w:sz w:val="19"/>
               </w:rPr>
               <w:t>Description</w:t>
             </w:r>
@@ -134,7 +134,7 @@
         </w:tc>
         <w:tc>
           <w:tcPr>
-            <w:tcW w:type="dxa" w:w="1560"/>
+            <w:tcW w:type="dxa" w:w="1656"/>
             <w:shd w:fill="E8F0FE"/>
           </w:tcPr>
           <w:p>
@@ -146,7 +146,7 @@
                 <w:rFonts w:ascii="Segoe UI" w:hAnsi="Segoe UI"/>
                 <w:b/>
                 <w:color w:val="1A73E8"/>
-                <w:sz w:val="20"/>
+                <w:sz w:val="19"/>
               </w:rPr>
               <w:t>Priority</w:t>
             </w:r>
@@ -154,7 +154,7 @@
         </w:tc>
         <w:tc>
           <w:tcPr>
-            <w:tcW w:type="dxa" w:w="1560"/>
+            <w:tcW w:type="dxa" w:w="1656"/>
             <w:shd w:fill="E8F0FE"/>
           </w:tcPr>
           <w:p>
@@ -166,7 +166,7 @@
                 <w:rFonts w:ascii="Segoe UI" w:hAnsi="Segoe UI"/>
                 <w:b/>
                 <w:color w:val="1A73E8"/>
-                <w:sz w:val="20"/>
+                <w:sz w:val="19"/>
               </w:rPr>
               <w:t>Acceptance Criteria</w:t>
             </w:r>
@@ -174,7 +174,7 @@
         </w:tc>
         <w:tc>
           <w:tcPr>
-            <w:tcW w:type="dxa" w:w="1560"/>
+            <w:tcW w:type="dxa" w:w="1656"/>
             <w:shd w:fill="E8F0FE"/>
           </w:tcPr>
           <w:p>
@@ -186,7 +186,7 @@
                 <w:rFonts w:ascii="Segoe UI" w:hAnsi="Segoe UI"/>
                 <w:b/>
                 <w:color w:val="1A73E8"/>
-                <w:sz w:val="20"/>
+                <w:sz w:val="19"/>
               </w:rPr>
               <w:t>Rationale</w:t>
             </w:r>
@@ -196,14 +196,14 @@
       <w:tr>
         <w:tc>
           <w:tcPr>
-            <w:tcW w:type="dxa" w:w="1560"/>
+            <w:tcW w:type="dxa" w:w="1656"/>
           </w:tcPr>
           <w:p>
             <w:r>
               <w:rPr>
                 <w:rFonts w:ascii="Segoe UI" w:hAnsi="Segoe UI"/>
                 <w:b/>
-                <w:sz w:val="19"/>
+                <w:sz w:val="18"/>
               </w:rPr>
               <w:t>FR-001</w:t>
             </w:r>
@@ -211,13 +211,13 @@
         </w:tc>
         <w:tc>
           <w:tcPr>
-            <w:tcW w:type="dxa" w:w="1560"/>
+            <w:tcW w:type="dxa" w:w="1656"/>
           </w:tcPr>
           <w:p>
             <w:r>
               <w:rPr>
                 <w:rFonts w:ascii="Segoe UI" w:hAnsi="Segoe UI"/>
-                <w:sz w:val="19"/>
+                <w:sz w:val="18"/>
               </w:rPr>
               <w:t>Functional</w:t>
             </w:r>
@@ -225,13 +225,13 @@
         </w:tc>
         <w:tc>
           <w:tcPr>
-            <w:tcW w:type="dxa" w:w="1560"/>
+            <w:tcW w:type="dxa" w:w="1656"/>
           </w:tcPr>
           <w:p>
             <w:r>
               <w:rPr>
                 <w:rFonts w:ascii="Segoe UI" w:hAnsi="Segoe UI"/>
-                <w:sz w:val="19"/>
+                <w:sz w:val="18"/>
               </w:rPr>
               <w:t>The system shall calculate route compatibility between driver and passenger commute paths, permitting matches only within a 1.5 km detour tolerance.</w:t>
             </w:r>
@@ -239,13 +239,13 @@
         </w:tc>
         <w:tc>
           <w:tcPr>
-            <w:tcW w:type="dxa" w:w="1560"/>
+            <w:tcW w:type="dxa" w:w="1656"/>
           </w:tcPr>
           <w:p>
             <w:r>
               <w:rPr>
                 <w:rFonts w:ascii="Segoe UI" w:hAnsi="Segoe UI"/>
-                <w:sz w:val="19"/>
+                <w:sz w:val="18"/>
               </w:rPr>
               <w:t>High</w:t>
             </w:r>
@@ -253,13 +253,13 @@
         </w:tc>
         <w:tc>
           <w:tcPr>
-            <w:tcW w:type="dxa" w:w="1560"/>
+            <w:tcW w:type="dxa" w:w="1656"/>
           </w:tcPr>
           <w:p>
             <w:r>
               <w:rPr>
                 <w:rFonts w:ascii="Segoe UI" w:hAnsi="Segoe UI"/>
-                <w:sz w:val="19"/>
+                <w:sz w:val="18"/>
               </w:rPr>
               <w:t>Given a driver's route and a passenger's pickup/dropoff points, the system returns a match if and only if the total added detour distance for the driver is &lt;= 1.5 km.</w:t>
             </w:r>
@@ -267,13 +267,13 @@
         </w:tc>
         <w:tc>
           <w:tcPr>
-            <w:tcW w:type="dxa" w:w="1560"/>
+            <w:tcW w:type="dxa" w:w="1656"/>
           </w:tcPr>
           <w:p>
             <w:r>
               <w:rPr>
                 <w:rFonts w:ascii="Segoe UI" w:hAnsi="Segoe UI"/>
-                <w:sz w:val="19"/>
+                <w:sz w:val="18"/>
               </w:rPr>
               <w:t>Ensures drivers are not inconvenienced by excessive detours while finding compatible passenger routes.</w:t>
             </w:r>
@@ -283,14 +283,14 @@
       <w:tr>
         <w:tc>
           <w:tcPr>
-            <w:tcW w:type="dxa" w:w="1560"/>
+            <w:tcW w:type="dxa" w:w="1656"/>
           </w:tcPr>
           <w:p>
             <w:r>
               <w:rPr>
                 <w:rFonts w:ascii="Segoe UI" w:hAnsi="Segoe UI"/>
                 <w:b/>
-                <w:sz w:val="19"/>
+                <w:sz w:val="18"/>
               </w:rPr>
               <w:t>FR-002</w:t>
             </w:r>
@@ -298,13 +298,13 @@
         </w:tc>
         <w:tc>
           <w:tcPr>
-            <w:tcW w:type="dxa" w:w="1560"/>
+            <w:tcW w:type="dxa" w:w="1656"/>
           </w:tcPr>
           <w:p>
             <w:r>
               <w:rPr>
                 <w:rFonts w:ascii="Segoe UI" w:hAnsi="Segoe UI"/>
-                <w:sz w:val="19"/>
+                <w:sz w:val="18"/>
               </w:rPr>
               <w:t>Functional</w:t>
             </w:r>
@@ -312,13 +312,13 @@
         </w:tc>
         <w:tc>
           <w:tcPr>
-            <w:tcW w:type="dxa" w:w="1560"/>
+            <w:tcW w:type="dxa" w:w="1656"/>
           </w:tcPr>
           <w:p>
             <w:r>
               <w:rPr>
                 <w:rFonts w:ascii="Segoe UI" w:hAnsi="Segoe UI"/>
-                <w:sz w:val="19"/>
+                <w:sz w:val="18"/>
               </w:rPr>
               <w:t>The system shall calculate automated fuel cost share splits for matched trips based on total distance traveled, vehicle fuel efficiency, and current fuel prices, dividing the cost proportionally among occupants.</w:t>
             </w:r>
@@ -326,13 +326,13 @@
         </w:tc>
         <w:tc>
           <w:tcPr>
-            <w:tcW w:type="dxa" w:w="1560"/>
+            <w:tcW w:type="dxa" w:w="1656"/>
           </w:tcPr>
           <w:p>
             <w:r>
               <w:rPr>
                 <w:rFonts w:ascii="Segoe UI" w:hAnsi="Segoe UI"/>
-                <w:sz w:val="19"/>
+                <w:sz w:val="18"/>
               </w:rPr>
               <w:t>High</w:t>
             </w:r>
@@ -340,13 +340,13 @@
         </w:tc>
         <w:tc>
           <w:tcPr>
-            <w:tcW w:type="dxa" w:w="1560"/>
+            <w:tcW w:type="dxa" w:w="1656"/>
           </w:tcPr>
           <w:p>
             <w:r>
               <w:rPr>
                 <w:rFonts w:ascii="Segoe UI" w:hAnsi="Segoe UI"/>
-                <w:sz w:val="19"/>
+                <w:sz w:val="18"/>
               </w:rPr>
               <w:t>Upon completion of a shared ride, the system generates an itemized cost split bill showing total trip cost and each participant's exact share within 5 seconds.</w:t>
             </w:r>
@@ -354,13 +354,13 @@
         </w:tc>
         <w:tc>
           <w:tcPr>
-            <w:tcW w:type="dxa" w:w="1560"/>
+            <w:tcW w:type="dxa" w:w="1656"/>
           </w:tcPr>
           <w:p>
             <w:r>
               <w:rPr>
                 <w:rFonts w:ascii="Segoe UI" w:hAnsi="Segoe UI"/>
-                <w:sz w:val="19"/>
+                <w:sz w:val="18"/>
               </w:rPr>
               <w:t>Eliminates manual fare calculations and awkward negotiations by providing transparent, automated cost sharing based on objective parameters.</w:t>
             </w:r>
@@ -370,14 +370,14 @@
       <w:tr>
         <w:tc>
           <w:tcPr>
-            <w:tcW w:type="dxa" w:w="1560"/>
+            <w:tcW w:type="dxa" w:w="1656"/>
           </w:tcPr>
           <w:p>
             <w:r>
               <w:rPr>
                 <w:rFonts w:ascii="Segoe UI" w:hAnsi="Segoe UI"/>
                 <w:b/>
-                <w:sz w:val="19"/>
+                <w:sz w:val="18"/>
               </w:rPr>
               <w:t>FR-003</w:t>
             </w:r>
@@ -385,13 +385,13 @@
         </w:tc>
         <w:tc>
           <w:tcPr>
-            <w:tcW w:type="dxa" w:w="1560"/>
+            <w:tcW w:type="dxa" w:w="1656"/>
           </w:tcPr>
           <w:p>
             <w:r>
               <w:rPr>
                 <w:rFonts w:ascii="Segoe UI" w:hAnsi="Segoe UI"/>
-                <w:sz w:val="19"/>
+                <w:sz w:val="18"/>
               </w:rPr>
               <w:t>Functional</w:t>
             </w:r>
@@ -399,13 +399,13 @@
         </w:tc>
         <w:tc>
           <w:tcPr>
-            <w:tcW w:type="dxa" w:w="1560"/>
+            <w:tcW w:type="dxa" w:w="1656"/>
           </w:tcPr>
           <w:p>
             <w:r>
               <w:rPr>
                 <w:rFonts w:ascii="Segoe UI" w:hAnsi="Segoe UI"/>
-                <w:sz w:val="19"/>
+                <w:sz w:val="18"/>
               </w:rPr>
               <w:t>The system shall allow Driver Hosts and Rider Commuters to set recurring daily commute schedules (e.g., weekday morning/evening pickup times) and query matching commute schedules.</w:t>
             </w:r>
@@ -413,13 +413,13 @@
         </w:tc>
         <w:tc>
           <w:tcPr>
-            <w:tcW w:type="dxa" w:w="1560"/>
+            <w:tcW w:type="dxa" w:w="1656"/>
           </w:tcPr>
           <w:p>
             <w:r>
               <w:rPr>
                 <w:rFonts w:ascii="Segoe UI" w:hAnsi="Segoe UI"/>
-                <w:sz w:val="19"/>
+                <w:sz w:val="18"/>
               </w:rPr>
               <w:t>High</w:t>
             </w:r>
@@ -427,13 +427,13 @@
         </w:tc>
         <w:tc>
           <w:tcPr>
-            <w:tcW w:type="dxa" w:w="1560"/>
+            <w:tcW w:type="dxa" w:w="1656"/>
           </w:tcPr>
           <w:p>
             <w:r>
               <w:rPr>
                 <w:rFonts w:ascii="Segoe UI" w:hAnsi="Segoe UI"/>
-                <w:sz w:val="19"/>
+                <w:sz w:val="18"/>
               </w:rPr>
               <w:t>Users can define recurring weekly time slots and receive match notifications for overlapping routes within a ±15-minute departure window.</w:t>
             </w:r>
@@ -441,13 +441,13 @@
         </w:tc>
         <w:tc>
           <w:tcPr>
-            <w:tcW w:type="dxa" w:w="1560"/>
+            <w:tcW w:type="dxa" w:w="1656"/>
           </w:tcPr>
           <w:p>
             <w:r>
               <w:rPr>
                 <w:rFonts w:ascii="Segoe UI" w:hAnsi="Segoe UI"/>
-                <w:sz w:val="19"/>
+                <w:sz w:val="18"/>
               </w:rPr>
               <w:t>Enables regular daily commuters to establish consistent peer-to-peer carpooling routines without re-entering trip details daily.</w:t>
             </w:r>
@@ -457,14 +457,14 @@
       <w:tr>
         <w:tc>
           <w:tcPr>
-            <w:tcW w:type="dxa" w:w="1560"/>
+            <w:tcW w:type="dxa" w:w="1656"/>
           </w:tcPr>
           <w:p>
             <w:r>
               <w:rPr>
                 <w:rFonts w:ascii="Segoe UI" w:hAnsi="Segoe UI"/>
                 <w:b/>
-                <w:sz w:val="19"/>
+                <w:sz w:val="18"/>
               </w:rPr>
               <w:t>FR-004</w:t>
             </w:r>
@@ -472,13 +472,13 @@
         </w:tc>
         <w:tc>
           <w:tcPr>
-            <w:tcW w:type="dxa" w:w="1560"/>
+            <w:tcW w:type="dxa" w:w="1656"/>
           </w:tcPr>
           <w:p>
             <w:r>
               <w:rPr>
                 <w:rFonts w:ascii="Segoe UI" w:hAnsi="Segoe UI"/>
-                <w:sz w:val="19"/>
+                <w:sz w:val="18"/>
               </w:rPr>
               <w:t>Functional</w:t>
             </w:r>
@@ -486,13 +486,13 @@
         </w:tc>
         <w:tc>
           <w:tcPr>
-            <w:tcW w:type="dxa" w:w="1560"/>
+            <w:tcW w:type="dxa" w:w="1656"/>
           </w:tcPr>
           <w:p>
             <w:r>
               <w:rPr>
                 <w:rFonts w:ascii="Segoe UI" w:hAnsi="Segoe UI"/>
-                <w:sz w:val="19"/>
+                <w:sz w:val="18"/>
               </w:rPr>
               <w:t>The system shall require Driver Hosts to submit valid driving licenses and vehicle registration documents for verification before publishing ride offers.</w:t>
             </w:r>
@@ -500,13 +500,13 @@
         </w:tc>
         <w:tc>
           <w:tcPr>
-            <w:tcW w:type="dxa" w:w="1560"/>
+            <w:tcW w:type="dxa" w:w="1656"/>
           </w:tcPr>
           <w:p>
             <w:r>
               <w:rPr>
                 <w:rFonts w:ascii="Segoe UI" w:hAnsi="Segoe UI"/>
-                <w:sz w:val="19"/>
+                <w:sz w:val="18"/>
               </w:rPr>
               <w:t>High</w:t>
             </w:r>
@@ -514,13 +514,13 @@
         </w:tc>
         <w:tc>
           <w:tcPr>
-            <w:tcW w:type="dxa" w:w="1560"/>
+            <w:tcW w:type="dxa" w:w="1656"/>
           </w:tcPr>
           <w:p>
             <w:r>
               <w:rPr>
                 <w:rFonts w:ascii="Segoe UI" w:hAnsi="Segoe UI"/>
-                <w:sz w:val="19"/>
+                <w:sz w:val="18"/>
               </w:rPr>
               <w:t>Unverified driver accounts are prevented from posting ride offers until document verification status is approved by the system or administrator.</w:t>
             </w:r>
@@ -528,13 +528,13 @@
         </w:tc>
         <w:tc>
           <w:tcPr>
-            <w:tcW w:type="dxa" w:w="1560"/>
+            <w:tcW w:type="dxa" w:w="1656"/>
           </w:tcPr>
           <w:p>
             <w:r>
               <w:rPr>
                 <w:rFonts w:ascii="Segoe UI" w:hAnsi="Segoe UI"/>
-                <w:sz w:val="19"/>
+                <w:sz w:val="18"/>
               </w:rPr>
               <w:t>Establishes baseline safety, trust, and accountability among peer-to-peer carpool participants.</w:t>
             </w:r>
@@ -544,14 +544,14 @@
       <w:tr>
         <w:tc>
           <w:tcPr>
-            <w:tcW w:type="dxa" w:w="1560"/>
+            <w:tcW w:type="dxa" w:w="1656"/>
           </w:tcPr>
           <w:p>
             <w:r>
               <w:rPr>
                 <w:rFonts w:ascii="Segoe UI" w:hAnsi="Segoe UI"/>
                 <w:b/>
-                <w:sz w:val="19"/>
+                <w:sz w:val="18"/>
               </w:rPr>
               <w:t>FR-005</w:t>
             </w:r>
@@ -559,13 +559,13 @@
         </w:tc>
         <w:tc>
           <w:tcPr>
-            <w:tcW w:type="dxa" w:w="1560"/>
+            <w:tcW w:type="dxa" w:w="1656"/>
           </w:tcPr>
           <w:p>
             <w:r>
               <w:rPr>
                 <w:rFonts w:ascii="Segoe UI" w:hAnsi="Segoe UI"/>
-                <w:sz w:val="19"/>
+                <w:sz w:val="18"/>
               </w:rPr>
               <w:t>Functional</w:t>
             </w:r>
@@ -573,13 +573,13 @@
         </w:tc>
         <w:tc>
           <w:tcPr>
-            <w:tcW w:type="dxa" w:w="1560"/>
+            <w:tcW w:type="dxa" w:w="1656"/>
           </w:tcPr>
           <w:p>
             <w:r>
               <w:rPr>
                 <w:rFonts w:ascii="Segoe UI" w:hAnsi="Segoe UI"/>
-                <w:sz w:val="19"/>
+                <w:sz w:val="18"/>
               </w:rPr>
               <w:t>The system shall allow a Rider Commuter to send a ride request to a Driver Host for a compatible route and notify both parties upon acceptance or rejection.</w:t>
             </w:r>
@@ -587,13 +587,13 @@
         </w:tc>
         <w:tc>
           <w:tcPr>
-            <w:tcW w:type="dxa" w:w="1560"/>
+            <w:tcW w:type="dxa" w:w="1656"/>
           </w:tcPr>
           <w:p>
             <w:r>
               <w:rPr>
                 <w:rFonts w:ascii="Segoe UI" w:hAnsi="Segoe UI"/>
-                <w:sz w:val="19"/>
+                <w:sz w:val="18"/>
               </w:rPr>
               <w:t>Medium</w:t>
             </w:r>
@@ -601,13 +601,13 @@
         </w:tc>
         <w:tc>
           <w:tcPr>
-            <w:tcW w:type="dxa" w:w="1560"/>
+            <w:tcW w:type="dxa" w:w="1656"/>
           </w:tcPr>
           <w:p>
             <w:r>
               <w:rPr>
                 <w:rFonts w:ascii="Segoe UI" w:hAnsi="Segoe UI"/>
-                <w:sz w:val="19"/>
+                <w:sz w:val="18"/>
               </w:rPr>
               <w:t>Driver Hosts receive real-time notifications of ride requests and can accept or decline within a 30-minute window, updating seat availability automatically.</w:t>
             </w:r>
@@ -615,13 +615,13 @@
         </w:tc>
         <w:tc>
           <w:tcPr>
-            <w:tcW w:type="dxa" w:w="1560"/>
+            <w:tcW w:type="dxa" w:w="1656"/>
           </w:tcPr>
           <w:p>
             <w:r>
               <w:rPr>
                 <w:rFonts w:ascii="Segoe UI" w:hAnsi="Segoe UI"/>
-                <w:sz w:val="19"/>
+                <w:sz w:val="18"/>
               </w:rPr>
               <w:t>Facilitates direct peer-to-peer agreement and prevents overbooking of available vehicle seats.</w:t>
             </w:r>
@@ -631,14 +631,14 @@
       <w:tr>
         <w:tc>
           <w:tcPr>
-            <w:tcW w:type="dxa" w:w="1560"/>
+            <w:tcW w:type="dxa" w:w="1656"/>
           </w:tcPr>
           <w:p>
             <w:r>
               <w:rPr>
                 <w:rFonts w:ascii="Segoe UI" w:hAnsi="Segoe UI"/>
                 <w:b/>
-                <w:sz w:val="19"/>
+                <w:sz w:val="18"/>
               </w:rPr>
               <w:t>NFR-001</w:t>
             </w:r>
@@ -646,13 +646,13 @@
         </w:tc>
         <w:tc>
           <w:tcPr>
-            <w:tcW w:type="dxa" w:w="1560"/>
+            <w:tcW w:type="dxa" w:w="1656"/>
           </w:tcPr>
           <w:p>
             <w:r>
               <w:rPr>
                 <w:rFonts w:ascii="Segoe UI" w:hAnsi="Segoe UI"/>
-                <w:sz w:val="19"/>
+                <w:sz w:val="18"/>
               </w:rPr>
               <w:t>Non-Functional</w:t>
             </w:r>
@@ -660,13 +660,13 @@
         </w:tc>
         <w:tc>
           <w:tcPr>
-            <w:tcW w:type="dxa" w:w="1560"/>
+            <w:tcW w:type="dxa" w:w="1656"/>
           </w:tcPr>
           <w:p>
             <w:r>
               <w:rPr>
                 <w:rFonts w:ascii="Segoe UI" w:hAnsi="Segoe UI"/>
-                <w:sz w:val="19"/>
+                <w:sz w:val="18"/>
               </w:rPr>
               <w:t>User ratings, driving license verification documents, and travel histories must be stored securely with encrypted backups.</w:t>
             </w:r>
@@ -674,13 +674,13 @@
         </w:tc>
         <w:tc>
           <w:tcPr>
-            <w:tcW w:type="dxa" w:w="1560"/>
+            <w:tcW w:type="dxa" w:w="1656"/>
           </w:tcPr>
           <w:p>
             <w:r>
               <w:rPr>
                 <w:rFonts w:ascii="Segoe UI" w:hAnsi="Segoe UI"/>
-                <w:sz w:val="19"/>
+                <w:sz w:val="18"/>
               </w:rPr>
               <w:t>High</w:t>
             </w:r>
@@ -688,13 +688,13 @@
         </w:tc>
         <w:tc>
           <w:tcPr>
-            <w:tcW w:type="dxa" w:w="1560"/>
+            <w:tcW w:type="dxa" w:w="1656"/>
           </w:tcPr>
           <w:p>
             <w:r>
               <w:rPr>
                 <w:rFonts w:ascii="Segoe UI" w:hAnsi="Segoe UI"/>
-                <w:sz w:val="19"/>
+                <w:sz w:val="18"/>
               </w:rPr>
               <w:t>Sensitive verification documents and travel logs are encrypted at rest using AES-256 and in transit using TLS 1.3, with automated daily encrypted backups.</w:t>
             </w:r>
@@ -702,13 +702,13 @@
         </w:tc>
         <w:tc>
           <w:tcPr>
-            <w:tcW w:type="dxa" w:w="1560"/>
+            <w:tcW w:type="dxa" w:w="1656"/>
           </w:tcPr>
           <w:p>
             <w:r>
               <w:rPr>
                 <w:rFonts w:ascii="Segoe UI" w:hAnsi="Segoe UI"/>
-                <w:sz w:val="19"/>
+                <w:sz w:val="18"/>
               </w:rPr>
               <w:t>Protects personally identifiable information (PII) and legal verification documents from data breaches and unauthorized access in compliance with privacy standards.</w:t>
             </w:r>
@@ -718,14 +718,14 @@
       <w:tr>
         <w:tc>
           <w:tcPr>
-            <w:tcW w:type="dxa" w:w="1560"/>
+            <w:tcW w:type="dxa" w:w="1656"/>
           </w:tcPr>
           <w:p>
             <w:r>
               <w:rPr>
                 <w:rFonts w:ascii="Segoe UI" w:hAnsi="Segoe UI"/>
                 <w:b/>
-                <w:sz w:val="19"/>
+                <w:sz w:val="18"/>
               </w:rPr>
               <w:t>NFR-002</w:t>
             </w:r>
@@ -733,13 +733,13 @@
         </w:tc>
         <w:tc>
           <w:tcPr>
-            <w:tcW w:type="dxa" w:w="1560"/>
+            <w:tcW w:type="dxa" w:w="1656"/>
           </w:tcPr>
           <w:p>
             <w:r>
               <w:rPr>
                 <w:rFonts w:ascii="Segoe UI" w:hAnsi="Segoe UI"/>
-                <w:sz w:val="19"/>
+                <w:sz w:val="18"/>
               </w:rPr>
               <w:t>Non-Functional</w:t>
             </w:r>
@@ -747,13 +747,13 @@
         </w:tc>
         <w:tc>
           <w:tcPr>
-            <w:tcW w:type="dxa" w:w="1560"/>
+            <w:tcW w:type="dxa" w:w="1656"/>
           </w:tcPr>
           <w:p>
             <w:r>
               <w:rPr>
                 <w:rFonts w:ascii="Segoe UI" w:hAnsi="Segoe UI"/>
-                <w:sz w:val="19"/>
+                <w:sz w:val="18"/>
               </w:rPr>
               <w:t>The system shall compute route matching and detour tolerance calculations for incoming ride search queries within 2 seconds under a concurrent load of up to 1,000 active queries.</w:t>
             </w:r>
@@ -761,13 +761,13 @@
         </w:tc>
         <w:tc>
           <w:tcPr>
-            <w:tcW w:type="dxa" w:w="1560"/>
+            <w:tcW w:type="dxa" w:w="1656"/>
           </w:tcPr>
           <w:p>
             <w:r>
               <w:rPr>
                 <w:rFonts w:ascii="Segoe UI" w:hAnsi="Segoe UI"/>
-                <w:sz w:val="19"/>
+                <w:sz w:val="18"/>
               </w:rPr>
               <w:t>High</w:t>
             </w:r>
@@ -775,13 +775,13 @@
         </w:tc>
         <w:tc>
           <w:tcPr>
-            <w:tcW w:type="dxa" w:w="1560"/>
+            <w:tcW w:type="dxa" w:w="1656"/>
           </w:tcPr>
           <w:p>
             <w:r>
               <w:rPr>
                 <w:rFonts w:ascii="Segoe UI" w:hAnsi="Segoe UI"/>
-                <w:sz w:val="19"/>
+                <w:sz w:val="18"/>
               </w:rPr>
               <w:t>95% of route search queries return sorted match results within 2,000 milliseconds during stress testing at peak simulated load.</w:t>
             </w:r>
@@ -789,13 +789,13 @@
         </w:tc>
         <w:tc>
           <w:tcPr>
-            <w:tcW w:type="dxa" w:w="1560"/>
+            <w:tcW w:type="dxa" w:w="1656"/>
           </w:tcPr>
           <w:p>
             <w:r>
               <w:rPr>
                 <w:rFonts w:ascii="Segoe UI" w:hAnsi="Segoe UI"/>
-                <w:sz w:val="19"/>
+                <w:sz w:val="18"/>
               </w:rPr>
               <w:t>Ensures a responsive user experience so commuters can quickly evaluate matching rides during peak rush-hour usage.</w:t>
             </w:r>
@@ -816,7 +816,7 @@
         <w:rPr>
           <w:color w:val="1A73E8"/>
         </w:rPr>
-        <w:t>2. Detailed Requirements Breakdown</w:t>
+        <w:t>Detailed Requirements Breakdown</w:t>
       </w:r>
     </w:p>
     <w:p>
@@ -835,7 +835,7 @@
         <w:rPr>
           <w:b/>
         </w:rPr>
-        <w:t xml:space="preserve">• ID: </w:t>
+        <w:t xml:space="preserve">• Req ID: </w:t>
       </w:r>
       <w:r>
         <w:t>FR-001</w:t>
@@ -907,7 +907,7 @@
         <w:rPr>
           <w:b/>
         </w:rPr>
-        <w:t xml:space="preserve">• ID: </w:t>
+        <w:t xml:space="preserve">• Req ID: </w:t>
       </w:r>
       <w:r>
         <w:t>FR-002</w:t>
@@ -979,7 +979,7 @@
         <w:rPr>
           <w:b/>
         </w:rPr>
-        <w:t xml:space="preserve">• ID: </w:t>
+        <w:t xml:space="preserve">• Req ID: </w:t>
       </w:r>
       <w:r>
         <w:t>FR-003</w:t>
@@ -1051,7 +1051,7 @@
         <w:rPr>
           <w:b/>
         </w:rPr>
-        <w:t xml:space="preserve">• ID: </w:t>
+        <w:t xml:space="preserve">• Req ID: </w:t>
       </w:r>
       <w:r>
         <w:t>FR-004</w:t>
@@ -1123,7 +1123,7 @@
         <w:rPr>
           <w:b/>
         </w:rPr>
-        <w:t xml:space="preserve">• ID: </w:t>
+        <w:t xml:space="preserve">• Req ID: </w:t>
       </w:r>
       <w:r>
         <w:t>FR-005</w:t>
@@ -1195,7 +1195,7 @@
         <w:rPr>
           <w:b/>
         </w:rPr>
-        <w:t xml:space="preserve">• ID: </w:t>
+        <w:t xml:space="preserve">• Req ID: </w:t>
       </w:r>
       <w:r>
         <w:t>NFR-001</w:t>
@@ -1267,7 +1267,7 @@
         <w:rPr>
           <w:b/>
         </w:rPr>
-        <w:t xml:space="preserve">• ID: </w:t>
+        <w:t xml:space="preserve">• Req ID: </w:t>
       </w:r>
       <w:r>
         <w:t>NFR-002</w:t>
@@ -1325,7 +1325,7 @@
     </w:p>
     <w:sectPr>
       <w:pgSz w:w="12240" w:h="15840"/>
-      <w:pgMar w:top="1440" w:right="1440" w:bottom="1440" w:left="1440" w:header="720" w:footer="720" w:gutter="0"/>
+      <w:pgMar w:top="1152" w:right="1152" w:bottom="1152" w:left="1152" w:header="720" w:footer="720" w:gutter="0"/>
       <w:cols w:space="720"/>
       <w:docGrid w:linePitch="360"/>
     </w:sectPr>

</xml_diff>

<commit_message>
Align use case IDs (UC-08, UC-09, UC-07, UC-10, UC-11) across diagram, docs, and PDFs
</commit_message>
<xml_diff>
--- a/Lab1/requirements.docx
+++ b/Lab1/requirements.docx
@@ -3,46 +3,11 @@
 <w:document xmlns:wpc="http://schemas.microsoft.com/office/word/2010/wordprocessingCanvas" xmlns:mo="http://schemas.microsoft.com/office/mac/office/2008/main" xmlns:mc="http://schemas.openxmlformats.org/markup-compatibility/2006" xmlns:mv="urn:schemas-microsoft-com:mac:vml" xmlns:o="urn:schemas-microsoft-com:office:office" xmlns:r="http://schemas.openxmlformats.org/officeDocument/2006/relationships" xmlns:m="http://schemas.openxmlformats.org/officeDocument/2006/math" xmlns:v="urn:schemas-microsoft-com:vml" xmlns:wp14="http://schemas.microsoft.com/office/word/2010/wordprocessingDrawing" xmlns:wp="http://schemas.openxmlformats.org/drawingml/2006/wordprocessingDrawing" xmlns:w10="urn:schemas-microsoft-com:office:word" xmlns:w="http://schemas.openxmlformats.org/wordprocessingml/2006/main" xmlns:w14="http://schemas.microsoft.com/office/word/2010/wordml" xmlns:wpg="http://schemas.microsoft.com/office/word/2010/wordprocessingGroup" xmlns:wpi="http://schemas.microsoft.com/office/word/2010/wordprocessingInk" xmlns:wne="http://schemas.microsoft.com/office/word/2006/wordml" xmlns:wps="http://schemas.microsoft.com/office/word/2010/wordprocessingShape" mc:Ignorable="w14 wp14">
   <w:body>
     <w:p>
+      <w:pPr>
+        <w:pStyle w:val="Heading1"/>
+      </w:pPr>
       <w:r>
-        <w:rPr>
-          <w:rFonts w:ascii="Segoe UI" w:hAnsi="Segoe UI"/>
-          <w:b/>
-          <w:color w:val="1A73E8"/>
-          <w:sz w:val="40"/>
-        </w:rPr>
         <w:t>Peer-to-Peer Carpooling &amp; Expense Splitter</w:t>
-      </w:r>
-    </w:p>
-    <w:p>
-      <w:r>
-        <w:rPr>
-          <w:rFonts w:ascii="Segoe UI" w:hAnsi="Segoe UI"/>
-          <w:b/>
-          <w:color w:val="137333"/>
-          <w:sz w:val="26"/>
-        </w:rPr>
-        <w:t>Software Requirements Specification (SRS) - Lab 1</w:t>
-      </w:r>
-    </w:p>
-    <w:p>
-      <w:r>
-        <w:rPr>
-          <w:b/>
-        </w:rPr>
-        <w:t xml:space="preserve">Problem Statement: </w:t>
-      </w:r>
-      <w:r>
-        <w:t>A commuter ridesharing portal that matches drivers and passengers with overlapping daily routes, enforces detour tolerance thresholds, and calculates automated fuel cost share splits.</w:t>
-        <w:br/>
-      </w:r>
-      <w:r>
-        <w:rPr>
-          <w:b/>
-        </w:rPr>
-        <w:t xml:space="preserve">Key Actors: </w:t>
-      </w:r>
-      <w:r>
-        <w:t>Rider Commuter, Driver Host</w:t>
       </w:r>
     </w:p>
     <w:p>
@@ -50,9 +15,38 @@
         <w:pStyle w:val="Heading2"/>
       </w:pPr>
       <w:r>
+        <w:t>Software Requirements Specification (SRS) - Lab 1</w:t>
+      </w:r>
+    </w:p>
+    <w:p>
+      <w:r/>
+      <w:r>
         <w:rPr>
-          <w:color w:val="1A73E8"/>
+          <w:b/>
         </w:rPr>
+        <w:t>Problem Statement:</w:t>
+      </w:r>
+      <w:r>
+        <w:t xml:space="preserve"> A commuter ridesharing portal that matches drivers and passengers with overlapping daily routes, enforces detour tolerance thresholds, and calculates automated fuel cost share splits.</w:t>
+      </w:r>
+    </w:p>
+    <w:p>
+      <w:r/>
+      <w:r>
+        <w:rPr>
+          <w:b/>
+        </w:rPr>
+        <w:t>Key Actors:</w:t>
+      </w:r>
+      <w:r>
+        <w:t xml:space="preserve"> Rider Commuter, Driver Host</w:t>
+      </w:r>
+    </w:p>
+    <w:p>
+      <w:pPr>
+        <w:pStyle w:val="Heading3"/>
+      </w:pPr>
+      <w:r>
         <w:t>Requirements Summary Table</w:t>
       </w:r>
     </w:p>
@@ -60,7 +54,6 @@
       <w:tblPr>
         <w:tblW w:type="auto" w:w="0"/>
         <w:jc w:val="center"/>
-        <w:tblLayout w:type="fixed"/>
         <w:tblLook w:firstColumn="1" w:firstRow="1" w:lastColumn="0" w:lastRow="0" w:noHBand="0" w:noVBand="1" w:val="04A0"/>
       </w:tblPr>
       <w:tblGrid>
@@ -75,38 +68,26 @@
         <w:tc>
           <w:tcPr>
             <w:tcW w:type="dxa" w:w="1656"/>
-            <w:shd w:fill="E8F0FE"/>
           </w:tcPr>
           <w:p>
-            <w:pPr>
-              <w:jc w:val="left"/>
-            </w:pPr>
             <w:r>
               <w:rPr>
-                <w:rFonts w:ascii="Segoe UI" w:hAnsi="Segoe UI"/>
                 <w:b/>
                 <w:color w:val="1A73E8"/>
-                <w:sz w:val="19"/>
               </w:rPr>
-              <w:t>Req ID</w:t>
+              <w:t>ID</w:t>
             </w:r>
           </w:p>
         </w:tc>
         <w:tc>
           <w:tcPr>
             <w:tcW w:type="dxa" w:w="1656"/>
-            <w:shd w:fill="E8F0FE"/>
           </w:tcPr>
           <w:p>
-            <w:pPr>
-              <w:jc w:val="left"/>
-            </w:pPr>
             <w:r>
               <w:rPr>
-                <w:rFonts w:ascii="Segoe UI" w:hAnsi="Segoe UI"/>
                 <w:b/>
                 <w:color w:val="1A73E8"/>
-                <w:sz w:val="19"/>
               </w:rPr>
               <w:t>Type</w:t>
             </w:r>
@@ -115,18 +96,12 @@
         <w:tc>
           <w:tcPr>
             <w:tcW w:type="dxa" w:w="1656"/>
-            <w:shd w:fill="E8F0FE"/>
           </w:tcPr>
           <w:p>
-            <w:pPr>
-              <w:jc w:val="left"/>
-            </w:pPr>
             <w:r>
               <w:rPr>
-                <w:rFonts w:ascii="Segoe UI" w:hAnsi="Segoe UI"/>
                 <w:b/>
                 <w:color w:val="1A73E8"/>
-                <w:sz w:val="19"/>
               </w:rPr>
               <w:t>Description</w:t>
             </w:r>
@@ -135,18 +110,12 @@
         <w:tc>
           <w:tcPr>
             <w:tcW w:type="dxa" w:w="1656"/>
-            <w:shd w:fill="E8F0FE"/>
           </w:tcPr>
           <w:p>
-            <w:pPr>
-              <w:jc w:val="left"/>
-            </w:pPr>
             <w:r>
               <w:rPr>
-                <w:rFonts w:ascii="Segoe UI" w:hAnsi="Segoe UI"/>
                 <w:b/>
                 <w:color w:val="1A73E8"/>
-                <w:sz w:val="19"/>
               </w:rPr>
               <w:t>Priority</w:t>
             </w:r>
@@ -155,18 +124,12 @@
         <w:tc>
           <w:tcPr>
             <w:tcW w:type="dxa" w:w="1656"/>
-            <w:shd w:fill="E8F0FE"/>
           </w:tcPr>
           <w:p>
-            <w:pPr>
-              <w:jc w:val="left"/>
-            </w:pPr>
             <w:r>
               <w:rPr>
-                <w:rFonts w:ascii="Segoe UI" w:hAnsi="Segoe UI"/>
                 <w:b/>
                 <w:color w:val="1A73E8"/>
-                <w:sz w:val="19"/>
               </w:rPr>
               <w:t>Acceptance Criteria</w:t>
             </w:r>
@@ -175,18 +138,12 @@
         <w:tc>
           <w:tcPr>
             <w:tcW w:type="dxa" w:w="1656"/>
-            <w:shd w:fill="E8F0FE"/>
           </w:tcPr>
           <w:p>
-            <w:pPr>
-              <w:jc w:val="left"/>
-            </w:pPr>
             <w:r>
               <w:rPr>
-                <w:rFonts w:ascii="Segoe UI" w:hAnsi="Segoe UI"/>
                 <w:b/>
                 <w:color w:val="1A73E8"/>
-                <w:sz w:val="19"/>
               </w:rPr>
               <w:t>Rationale</w:t>
             </w:r>
@@ -200,12 +157,7 @@
           </w:tcPr>
           <w:p>
             <w:r>
-              <w:rPr>
-                <w:rFonts w:ascii="Segoe UI" w:hAnsi="Segoe UI"/>
-                <w:b/>
-                <w:sz w:val="18"/>
-              </w:rPr>
-              <w:t>FR-001</w:t>
+              <w:t>**FR-001**</w:t>
             </w:r>
           </w:p>
         </w:tc>
@@ -215,10 +167,6 @@
           </w:tcPr>
           <w:p>
             <w:r>
-              <w:rPr>
-                <w:rFonts w:ascii="Segoe UI" w:hAnsi="Segoe UI"/>
-                <w:sz w:val="18"/>
-              </w:rPr>
               <w:t>Functional</w:t>
             </w:r>
           </w:p>
@@ -229,10 +177,6 @@
           </w:tcPr>
           <w:p>
             <w:r>
-              <w:rPr>
-                <w:rFonts w:ascii="Segoe UI" w:hAnsi="Segoe UI"/>
-                <w:sz w:val="18"/>
-              </w:rPr>
               <w:t>The system shall calculate route compatibility between driver and passenger commute paths, permitting matches only within a 1.5 km detour tolerance.</w:t>
             </w:r>
           </w:p>
@@ -243,10 +187,6 @@
           </w:tcPr>
           <w:p>
             <w:r>
-              <w:rPr>
-                <w:rFonts w:ascii="Segoe UI" w:hAnsi="Segoe UI"/>
-                <w:sz w:val="18"/>
-              </w:rPr>
               <w:t>High</w:t>
             </w:r>
           </w:p>
@@ -257,11 +197,7 @@
           </w:tcPr>
           <w:p>
             <w:r>
-              <w:rPr>
-                <w:rFonts w:ascii="Segoe UI" w:hAnsi="Segoe UI"/>
-                <w:sz w:val="18"/>
-              </w:rPr>
-              <w:t>Given a driver's route and a passenger's pickup/dropoff points, the system returns a match if and only if the total added detour distance for the driver is &lt;= 1.5 km.</w:t>
+              <w:t>Given a driver's route and a passenger's pickup/dropoff points, the system returns a match if and only if the total added detour distance for the driver is $\le$ 1.5 km.</w:t>
             </w:r>
           </w:p>
         </w:tc>
@@ -271,10 +207,6 @@
           </w:tcPr>
           <w:p>
             <w:r>
-              <w:rPr>
-                <w:rFonts w:ascii="Segoe UI" w:hAnsi="Segoe UI"/>
-                <w:sz w:val="18"/>
-              </w:rPr>
               <w:t>Ensures drivers are not inconvenienced by excessive detours while finding compatible passenger routes.</w:t>
             </w:r>
           </w:p>
@@ -287,12 +219,7 @@
           </w:tcPr>
           <w:p>
             <w:r>
-              <w:rPr>
-                <w:rFonts w:ascii="Segoe UI" w:hAnsi="Segoe UI"/>
-                <w:b/>
-                <w:sz w:val="18"/>
-              </w:rPr>
-              <w:t>FR-002</w:t>
+              <w:t>**FR-002**</w:t>
             </w:r>
           </w:p>
         </w:tc>
@@ -302,10 +229,6 @@
           </w:tcPr>
           <w:p>
             <w:r>
-              <w:rPr>
-                <w:rFonts w:ascii="Segoe UI" w:hAnsi="Segoe UI"/>
-                <w:sz w:val="18"/>
-              </w:rPr>
               <w:t>Functional</w:t>
             </w:r>
           </w:p>
@@ -316,10 +239,6 @@
           </w:tcPr>
           <w:p>
             <w:r>
-              <w:rPr>
-                <w:rFonts w:ascii="Segoe UI" w:hAnsi="Segoe UI"/>
-                <w:sz w:val="18"/>
-              </w:rPr>
               <w:t>The system shall calculate automated fuel cost share splits for matched trips based on total distance traveled, vehicle fuel efficiency, and current fuel prices, dividing the cost proportionally among occupants.</w:t>
             </w:r>
           </w:p>
@@ -330,10 +249,6 @@
           </w:tcPr>
           <w:p>
             <w:r>
-              <w:rPr>
-                <w:rFonts w:ascii="Segoe UI" w:hAnsi="Segoe UI"/>
-                <w:sz w:val="18"/>
-              </w:rPr>
               <w:t>High</w:t>
             </w:r>
           </w:p>
@@ -344,10 +259,6 @@
           </w:tcPr>
           <w:p>
             <w:r>
-              <w:rPr>
-                <w:rFonts w:ascii="Segoe UI" w:hAnsi="Segoe UI"/>
-                <w:sz w:val="18"/>
-              </w:rPr>
               <w:t>Upon completion of a shared ride, the system generates an itemized cost split bill showing total trip cost and each participant's exact share within 5 seconds.</w:t>
             </w:r>
           </w:p>
@@ -358,10 +269,6 @@
           </w:tcPr>
           <w:p>
             <w:r>
-              <w:rPr>
-                <w:rFonts w:ascii="Segoe UI" w:hAnsi="Segoe UI"/>
-                <w:sz w:val="18"/>
-              </w:rPr>
               <w:t>Eliminates manual fare calculations and awkward negotiations by providing transparent, automated cost sharing based on objective parameters.</w:t>
             </w:r>
           </w:p>
@@ -374,12 +281,7 @@
           </w:tcPr>
           <w:p>
             <w:r>
-              <w:rPr>
-                <w:rFonts w:ascii="Segoe UI" w:hAnsi="Segoe UI"/>
-                <w:b/>
-                <w:sz w:val="18"/>
-              </w:rPr>
-              <w:t>FR-003</w:t>
+              <w:t>**FR-003**</w:t>
             </w:r>
           </w:p>
         </w:tc>
@@ -389,10 +291,6 @@
           </w:tcPr>
           <w:p>
             <w:r>
-              <w:rPr>
-                <w:rFonts w:ascii="Segoe UI" w:hAnsi="Segoe UI"/>
-                <w:sz w:val="18"/>
-              </w:rPr>
               <w:t>Functional</w:t>
             </w:r>
           </w:p>
@@ -403,10 +301,6 @@
           </w:tcPr>
           <w:p>
             <w:r>
-              <w:rPr>
-                <w:rFonts w:ascii="Segoe UI" w:hAnsi="Segoe UI"/>
-                <w:sz w:val="18"/>
-              </w:rPr>
               <w:t>The system shall allow Driver Hosts and Rider Commuters to set recurring daily commute schedules (e.g., weekday morning/evening pickup times) and query matching commute schedules.</w:t>
             </w:r>
           </w:p>
@@ -417,10 +311,6 @@
           </w:tcPr>
           <w:p>
             <w:r>
-              <w:rPr>
-                <w:rFonts w:ascii="Segoe UI" w:hAnsi="Segoe UI"/>
-                <w:sz w:val="18"/>
-              </w:rPr>
               <w:t>High</w:t>
             </w:r>
           </w:p>
@@ -431,11 +321,7 @@
           </w:tcPr>
           <w:p>
             <w:r>
-              <w:rPr>
-                <w:rFonts w:ascii="Segoe UI" w:hAnsi="Segoe UI"/>
-                <w:sz w:val="18"/>
-              </w:rPr>
-              <w:t>Users can define recurring weekly time slots and receive match notifications for overlapping routes within a ±15-minute departure window.</w:t>
+              <w:t>Users can define recurring weekly time slots and receive match notifications for overlapping routes within a $\pm$15-minute departure window.</w:t>
             </w:r>
           </w:p>
         </w:tc>
@@ -445,10 +331,6 @@
           </w:tcPr>
           <w:p>
             <w:r>
-              <w:rPr>
-                <w:rFonts w:ascii="Segoe UI" w:hAnsi="Segoe UI"/>
-                <w:sz w:val="18"/>
-              </w:rPr>
               <w:t>Enables regular daily commuters to establish consistent peer-to-peer carpooling routines without re-entering trip details daily.</w:t>
             </w:r>
           </w:p>
@@ -461,12 +343,7 @@
           </w:tcPr>
           <w:p>
             <w:r>
-              <w:rPr>
-                <w:rFonts w:ascii="Segoe UI" w:hAnsi="Segoe UI"/>
-                <w:b/>
-                <w:sz w:val="18"/>
-              </w:rPr>
-              <w:t>FR-004</w:t>
+              <w:t>**FR-004**</w:t>
             </w:r>
           </w:p>
         </w:tc>
@@ -476,10 +353,6 @@
           </w:tcPr>
           <w:p>
             <w:r>
-              <w:rPr>
-                <w:rFonts w:ascii="Segoe UI" w:hAnsi="Segoe UI"/>
-                <w:sz w:val="18"/>
-              </w:rPr>
               <w:t>Functional</w:t>
             </w:r>
           </w:p>
@@ -490,10 +363,6 @@
           </w:tcPr>
           <w:p>
             <w:r>
-              <w:rPr>
-                <w:rFonts w:ascii="Segoe UI" w:hAnsi="Segoe UI"/>
-                <w:sz w:val="18"/>
-              </w:rPr>
               <w:t>The system shall require Driver Hosts to submit valid driving licenses and vehicle registration documents for verification before publishing ride offers.</w:t>
             </w:r>
           </w:p>
@@ -504,10 +373,6 @@
           </w:tcPr>
           <w:p>
             <w:r>
-              <w:rPr>
-                <w:rFonts w:ascii="Segoe UI" w:hAnsi="Segoe UI"/>
-                <w:sz w:val="18"/>
-              </w:rPr>
               <w:t>High</w:t>
             </w:r>
           </w:p>
@@ -518,10 +383,6 @@
           </w:tcPr>
           <w:p>
             <w:r>
-              <w:rPr>
-                <w:rFonts w:ascii="Segoe UI" w:hAnsi="Segoe UI"/>
-                <w:sz w:val="18"/>
-              </w:rPr>
               <w:t>Unverified driver accounts are prevented from posting ride offers until document verification status is approved by the system or administrator.</w:t>
             </w:r>
           </w:p>
@@ -532,10 +393,6 @@
           </w:tcPr>
           <w:p>
             <w:r>
-              <w:rPr>
-                <w:rFonts w:ascii="Segoe UI" w:hAnsi="Segoe UI"/>
-                <w:sz w:val="18"/>
-              </w:rPr>
               <w:t>Establishes baseline safety, trust, and accountability among peer-to-peer carpool participants.</w:t>
             </w:r>
           </w:p>
@@ -548,12 +405,7 @@
           </w:tcPr>
           <w:p>
             <w:r>
-              <w:rPr>
-                <w:rFonts w:ascii="Segoe UI" w:hAnsi="Segoe UI"/>
-                <w:b/>
-                <w:sz w:val="18"/>
-              </w:rPr>
-              <w:t>FR-005</w:t>
+              <w:t>**FR-005**</w:t>
             </w:r>
           </w:p>
         </w:tc>
@@ -563,10 +415,6 @@
           </w:tcPr>
           <w:p>
             <w:r>
-              <w:rPr>
-                <w:rFonts w:ascii="Segoe UI" w:hAnsi="Segoe UI"/>
-                <w:sz w:val="18"/>
-              </w:rPr>
               <w:t>Functional</w:t>
             </w:r>
           </w:p>
@@ -577,10 +425,6 @@
           </w:tcPr>
           <w:p>
             <w:r>
-              <w:rPr>
-                <w:rFonts w:ascii="Segoe UI" w:hAnsi="Segoe UI"/>
-                <w:sz w:val="18"/>
-              </w:rPr>
               <w:t>The system shall allow a Rider Commuter to send a ride request to a Driver Host for a compatible route and notify both parties upon acceptance or rejection.</w:t>
             </w:r>
           </w:p>
@@ -591,10 +435,6 @@
           </w:tcPr>
           <w:p>
             <w:r>
-              <w:rPr>
-                <w:rFonts w:ascii="Segoe UI" w:hAnsi="Segoe UI"/>
-                <w:sz w:val="18"/>
-              </w:rPr>
               <w:t>Medium</w:t>
             </w:r>
           </w:p>
@@ -605,10 +445,6 @@
           </w:tcPr>
           <w:p>
             <w:r>
-              <w:rPr>
-                <w:rFonts w:ascii="Segoe UI" w:hAnsi="Segoe UI"/>
-                <w:sz w:val="18"/>
-              </w:rPr>
               <w:t>Driver Hosts receive real-time notifications of ride requests and can accept or decline within a 30-minute window, updating seat availability automatically.</w:t>
             </w:r>
           </w:p>
@@ -619,10 +455,6 @@
           </w:tcPr>
           <w:p>
             <w:r>
-              <w:rPr>
-                <w:rFonts w:ascii="Segoe UI" w:hAnsi="Segoe UI"/>
-                <w:sz w:val="18"/>
-              </w:rPr>
               <w:t>Facilitates direct peer-to-peer agreement and prevents overbooking of available vehicle seats.</w:t>
             </w:r>
           </w:p>
@@ -635,12 +467,7 @@
           </w:tcPr>
           <w:p>
             <w:r>
-              <w:rPr>
-                <w:rFonts w:ascii="Segoe UI" w:hAnsi="Segoe UI"/>
-                <w:b/>
-                <w:sz w:val="18"/>
-              </w:rPr>
-              <w:t>NFR-001</w:t>
+              <w:t>**NFR-001**</w:t>
             </w:r>
           </w:p>
         </w:tc>
@@ -650,10 +477,6 @@
           </w:tcPr>
           <w:p>
             <w:r>
-              <w:rPr>
-                <w:rFonts w:ascii="Segoe UI" w:hAnsi="Segoe UI"/>
-                <w:sz w:val="18"/>
-              </w:rPr>
               <w:t>Non-Functional</w:t>
             </w:r>
           </w:p>
@@ -664,10 +487,6 @@
           </w:tcPr>
           <w:p>
             <w:r>
-              <w:rPr>
-                <w:rFonts w:ascii="Segoe UI" w:hAnsi="Segoe UI"/>
-                <w:sz w:val="18"/>
-              </w:rPr>
               <w:t>User ratings, driving license verification documents, and travel histories must be stored securely with encrypted backups.</w:t>
             </w:r>
           </w:p>
@@ -678,10 +497,6 @@
           </w:tcPr>
           <w:p>
             <w:r>
-              <w:rPr>
-                <w:rFonts w:ascii="Segoe UI" w:hAnsi="Segoe UI"/>
-                <w:sz w:val="18"/>
-              </w:rPr>
               <w:t>High</w:t>
             </w:r>
           </w:p>
@@ -692,10 +507,6 @@
           </w:tcPr>
           <w:p>
             <w:r>
-              <w:rPr>
-                <w:rFonts w:ascii="Segoe UI" w:hAnsi="Segoe UI"/>
-                <w:sz w:val="18"/>
-              </w:rPr>
               <w:t>Sensitive verification documents and travel logs are encrypted at rest using AES-256 and in transit using TLS 1.3, with automated daily encrypted backups.</w:t>
             </w:r>
           </w:p>
@@ -706,10 +517,6 @@
           </w:tcPr>
           <w:p>
             <w:r>
-              <w:rPr>
-                <w:rFonts w:ascii="Segoe UI" w:hAnsi="Segoe UI"/>
-                <w:sz w:val="18"/>
-              </w:rPr>
               <w:t>Protects personally identifiable information (PII) and legal verification documents from data breaches and unauthorized access in compliance with privacy standards.</w:t>
             </w:r>
           </w:p>
@@ -722,12 +529,7 @@
           </w:tcPr>
           <w:p>
             <w:r>
-              <w:rPr>
-                <w:rFonts w:ascii="Segoe UI" w:hAnsi="Segoe UI"/>
-                <w:b/>
-                <w:sz w:val="18"/>
-              </w:rPr>
-              <w:t>NFR-002</w:t>
+              <w:t>**NFR-002**</w:t>
             </w:r>
           </w:p>
         </w:tc>
@@ -737,10 +539,6 @@
           </w:tcPr>
           <w:p>
             <w:r>
-              <w:rPr>
-                <w:rFonts w:ascii="Segoe UI" w:hAnsi="Segoe UI"/>
-                <w:sz w:val="18"/>
-              </w:rPr>
               <w:t>Non-Functional</w:t>
             </w:r>
           </w:p>
@@ -751,10 +549,6 @@
           </w:tcPr>
           <w:p>
             <w:r>
-              <w:rPr>
-                <w:rFonts w:ascii="Segoe UI" w:hAnsi="Segoe UI"/>
-                <w:sz w:val="18"/>
-              </w:rPr>
               <w:t>The system shall compute route matching and detour tolerance calculations for incoming ride search queries within 2 seconds under a concurrent load of up to 1,000 active queries.</w:t>
             </w:r>
           </w:p>
@@ -765,10 +559,6 @@
           </w:tcPr>
           <w:p>
             <w:r>
-              <w:rPr>
-                <w:rFonts w:ascii="Segoe UI" w:hAnsi="Segoe UI"/>
-                <w:sz w:val="18"/>
-              </w:rPr>
               <w:t>High</w:t>
             </w:r>
           </w:p>
@@ -779,10 +569,6 @@
           </w:tcPr>
           <w:p>
             <w:r>
-              <w:rPr>
-                <w:rFonts w:ascii="Segoe UI" w:hAnsi="Segoe UI"/>
-                <w:sz w:val="18"/>
-              </w:rPr>
               <w:t>95% of route search queries return sorted match results within 2,000 milliseconds during stress testing at peak simulated load.</w:t>
             </w:r>
           </w:p>
@@ -793,10 +579,6 @@
           </w:tcPr>
           <w:p>
             <w:r>
-              <w:rPr>
-                <w:rFonts w:ascii="Segoe UI" w:hAnsi="Segoe UI"/>
-                <w:sz w:val="18"/>
-              </w:rPr>
               <w:t>Ensures a responsive user experience so commuters can quickly evaluate matching rides during peak rush-hour usage.</w:t>
             </w:r>
           </w:p>
@@ -804,523 +586,692 @@
       </w:tr>
     </w:tbl>
     <w:p>
-      <w:r>
-        <w:br w:type="page"/>
-      </w:r>
-    </w:p>
-    <w:p>
       <w:pPr>
-        <w:pStyle w:val="Heading2"/>
+        <w:pStyle w:val="Heading3"/>
       </w:pPr>
       <w:r>
-        <w:rPr>
-          <w:color w:val="1A73E8"/>
-        </w:rPr>
         <w:t>Detailed Requirements Breakdown</w:t>
       </w:r>
     </w:p>
     <w:p>
       <w:pPr>
-        <w:pStyle w:val="Heading3"/>
+        <w:pStyle w:val="Heading4"/>
       </w:pPr>
       <w:r>
-        <w:rPr>
-          <w:color w:val="202124"/>
-        </w:rPr>
-        <w:t>FR-001: Calculate route compatibility between driver and p...</w:t>
+        <w:t>Functional Requirements</w:t>
       </w:r>
     </w:p>
     <w:p>
       <w:r>
-        <w:rPr>
-          <w:b/>
-        </w:rPr>
-        <w:t xml:space="preserve">• Req ID: </w:t>
+        <w:t>##### FR-001: Route Compatibility &amp; Detour Tolerance Matching</w:t>
       </w:r>
-      <w:r>
-        <w:t>FR-001</w:t>
-        <w:br/>
-      </w:r>
+    </w:p>
+    <w:p>
+      <w:pPr>
+        <w:pStyle w:val="ListBullet"/>
+      </w:pPr>
+      <w:r/>
       <w:r>
         <w:rPr>
           <w:b/>
         </w:rPr>
-        <w:t xml:space="preserve">• Type: </w:t>
+        <w:t>ID:</w:t>
       </w:r>
       <w:r>
-        <w:t>Functional</w:t>
-        <w:br/>
+        <w:t xml:space="preserve"> FR-001</w:t>
       </w:r>
+    </w:p>
+    <w:p>
+      <w:pPr>
+        <w:pStyle w:val="ListBullet"/>
+      </w:pPr>
+      <w:r/>
       <w:r>
         <w:rPr>
           <w:b/>
         </w:rPr>
-        <w:t xml:space="preserve">• Description: </w:t>
+        <w:t>Type:</w:t>
       </w:r>
       <w:r>
-        <w:t>The system shall calculate route compatibility between driver and passenger commute paths, permitting matches only within a 1.5 km detour tolerance.</w:t>
-        <w:br/>
+        <w:t xml:space="preserve"> Functional</w:t>
       </w:r>
+    </w:p>
+    <w:p>
+      <w:pPr>
+        <w:pStyle w:val="ListBullet"/>
+      </w:pPr>
+      <w:r/>
       <w:r>
         <w:rPr>
           <w:b/>
         </w:rPr>
-        <w:t xml:space="preserve">• Priority: </w:t>
+        <w:t>Description:</w:t>
       </w:r>
       <w:r>
-        <w:t>High</w:t>
-        <w:br/>
+        <w:t xml:space="preserve"> The system shall calculate route compatibility between driver and passenger commute paths, permitting matches only within a 1.5 km detour tolerance.</w:t>
       </w:r>
+    </w:p>
+    <w:p>
+      <w:pPr>
+        <w:pStyle w:val="ListBullet"/>
+      </w:pPr>
+      <w:r/>
       <w:r>
         <w:rPr>
           <w:b/>
         </w:rPr>
-        <w:t xml:space="preserve">• Acceptance Criteria: </w:t>
+        <w:t>Priority:</w:t>
       </w:r>
       <w:r>
-        <w:t>Given a driver's route and a passenger's pickup/dropoff points, the system returns a match if and only if the total added detour distance for the driver is &lt;= 1.5 km.</w:t>
-        <w:br/>
+        <w:t xml:space="preserve"> High</w:t>
       </w:r>
+    </w:p>
+    <w:p>
+      <w:pPr>
+        <w:pStyle w:val="ListBullet"/>
+      </w:pPr>
+      <w:r/>
       <w:r>
         <w:rPr>
           <w:b/>
         </w:rPr>
-        <w:t xml:space="preserve">• Rationale: </w:t>
+        <w:t>Acceptance Criteria:</w:t>
       </w:r>
       <w:r>
-        <w:t>Ensures drivers are not inconvenienced by excessive detours while finding compatible passenger routes.</w:t>
+        <w:t xml:space="preserve"> Given a driver's route and a passenger's pickup/dropoff points, the system returns a match if and only if the total added detour distance for the driver does not exceed 1.5 km.</w:t>
       </w:r>
     </w:p>
     <w:p>
       <w:pPr>
-        <w:pStyle w:val="Heading3"/>
+        <w:pStyle w:val="ListBullet"/>
       </w:pPr>
+      <w:r/>
       <w:r>
         <w:rPr>
-          <w:color w:val="202124"/>
+          <w:b/>
         </w:rPr>
-        <w:t>FR-002: Calculate automated fuel cost share splits for mat...</w:t>
+        <w:t>Rationale:</w:t>
+      </w:r>
+      <w:r>
+        <w:t xml:space="preserve"> Ensures drivers are not inconvenienced by excessive detours while finding compatible passenger routes.</w:t>
       </w:r>
     </w:p>
     <w:p>
       <w:r>
-        <w:rPr>
-          <w:b/>
-        </w:rPr>
-        <w:t xml:space="preserve">• Req ID: </w:t>
+        <w:t>##### FR-002: Automated Fuel Cost Share Calculation</w:t>
       </w:r>
-      <w:r>
-        <w:t>FR-002</w:t>
-        <w:br/>
-      </w:r>
+    </w:p>
+    <w:p>
+      <w:pPr>
+        <w:pStyle w:val="ListBullet"/>
+      </w:pPr>
+      <w:r/>
       <w:r>
         <w:rPr>
           <w:b/>
         </w:rPr>
-        <w:t xml:space="preserve">• Type: </w:t>
+        <w:t>ID:</w:t>
       </w:r>
       <w:r>
-        <w:t>Functional</w:t>
-        <w:br/>
+        <w:t xml:space="preserve"> FR-002</w:t>
       </w:r>
+    </w:p>
+    <w:p>
+      <w:pPr>
+        <w:pStyle w:val="ListBullet"/>
+      </w:pPr>
+      <w:r/>
       <w:r>
         <w:rPr>
           <w:b/>
         </w:rPr>
-        <w:t xml:space="preserve">• Description: </w:t>
+        <w:t>Type:</w:t>
       </w:r>
       <w:r>
-        <w:t>The system shall calculate automated fuel cost share splits for matched trips based on total distance traveled, vehicle fuel efficiency, and current fuel prices, dividing the cost proportionally among occupants.</w:t>
-        <w:br/>
+        <w:t xml:space="preserve"> Functional</w:t>
       </w:r>
+    </w:p>
+    <w:p>
+      <w:pPr>
+        <w:pStyle w:val="ListBullet"/>
+      </w:pPr>
+      <w:r/>
       <w:r>
         <w:rPr>
           <w:b/>
         </w:rPr>
-        <w:t xml:space="preserve">• Priority: </w:t>
+        <w:t>Description:</w:t>
       </w:r>
       <w:r>
-        <w:t>High</w:t>
-        <w:br/>
+        <w:t xml:space="preserve"> The system shall calculate automated fuel cost share splits for matched trips based on total distance traveled, vehicle fuel efficiency, and current fuel prices, dividing the cost proportionally among occupants.</w:t>
       </w:r>
+    </w:p>
+    <w:p>
+      <w:pPr>
+        <w:pStyle w:val="ListBullet"/>
+      </w:pPr>
+      <w:r/>
       <w:r>
         <w:rPr>
           <w:b/>
         </w:rPr>
-        <w:t xml:space="preserve">• Acceptance Criteria: </w:t>
+        <w:t>Priority:</w:t>
       </w:r>
       <w:r>
-        <w:t>Upon completion of a shared ride, the system generates an itemized cost split bill showing total trip cost and each participant's exact share within 5 seconds.</w:t>
-        <w:br/>
+        <w:t xml:space="preserve"> High</w:t>
       </w:r>
+    </w:p>
+    <w:p>
+      <w:pPr>
+        <w:pStyle w:val="ListBullet"/>
+      </w:pPr>
+      <w:r/>
       <w:r>
         <w:rPr>
           <w:b/>
         </w:rPr>
-        <w:t xml:space="preserve">• Rationale: </w:t>
+        <w:t>Acceptance Criteria:</w:t>
       </w:r>
       <w:r>
-        <w:t>Eliminates manual fare calculations and awkward negotiations by providing transparent, automated cost sharing based on objective parameters.</w:t>
+        <w:t xml:space="preserve"> Upon completion of a shared ride, the system generates an itemized cost split bill showing total trip cost and each participant's exact share within 5 seconds.</w:t>
       </w:r>
     </w:p>
     <w:p>
       <w:pPr>
-        <w:pStyle w:val="Heading3"/>
+        <w:pStyle w:val="ListBullet"/>
       </w:pPr>
+      <w:r/>
       <w:r>
         <w:rPr>
-          <w:color w:val="202124"/>
+          <w:b/>
         </w:rPr>
-        <w:t>FR-003: Allow driver hosts and rider commuters to set recu...</w:t>
+        <w:t>Rationale:</w:t>
+      </w:r>
+      <w:r>
+        <w:t xml:space="preserve"> Eliminates manual fare calculations and awkward negotiations by providing transparent, automated cost sharing based on objective parameters.</w:t>
       </w:r>
     </w:p>
     <w:p>
       <w:r>
-        <w:rPr>
-          <w:b/>
-        </w:rPr>
-        <w:t xml:space="preserve">• Req ID: </w:t>
+        <w:t>##### FR-003: Recurring Commute Schedule Matching</w:t>
       </w:r>
-      <w:r>
-        <w:t>FR-003</w:t>
-        <w:br/>
-      </w:r>
+    </w:p>
+    <w:p>
+      <w:pPr>
+        <w:pStyle w:val="ListBullet"/>
+      </w:pPr>
+      <w:r/>
       <w:r>
         <w:rPr>
           <w:b/>
         </w:rPr>
-        <w:t xml:space="preserve">• Type: </w:t>
+        <w:t>ID:</w:t>
       </w:r>
       <w:r>
-        <w:t>Functional</w:t>
-        <w:br/>
+        <w:t xml:space="preserve"> FR-003</w:t>
       </w:r>
+    </w:p>
+    <w:p>
+      <w:pPr>
+        <w:pStyle w:val="ListBullet"/>
+      </w:pPr>
+      <w:r/>
       <w:r>
         <w:rPr>
           <w:b/>
         </w:rPr>
-        <w:t xml:space="preserve">• Description: </w:t>
+        <w:t>Type:</w:t>
       </w:r>
       <w:r>
-        <w:t>The system shall allow Driver Hosts and Rider Commuters to set recurring daily commute schedules (e.g., weekday morning/evening pickup times) and query matching commute schedules.</w:t>
-        <w:br/>
+        <w:t xml:space="preserve"> Functional</w:t>
       </w:r>
+    </w:p>
+    <w:p>
+      <w:pPr>
+        <w:pStyle w:val="ListBullet"/>
+      </w:pPr>
+      <w:r/>
       <w:r>
         <w:rPr>
           <w:b/>
         </w:rPr>
-        <w:t xml:space="preserve">• Priority: </w:t>
+        <w:t>Description:</w:t>
       </w:r>
       <w:r>
-        <w:t>High</w:t>
-        <w:br/>
+        <w:t xml:space="preserve"> The system shall allow Driver Hosts and Rider Commuters to set recurring daily commute schedules (e.g., weekday morning/evening pickup times) and query matching commute schedules.</w:t>
       </w:r>
+    </w:p>
+    <w:p>
+      <w:pPr>
+        <w:pStyle w:val="ListBullet"/>
+      </w:pPr>
+      <w:r/>
       <w:r>
         <w:rPr>
           <w:b/>
         </w:rPr>
-        <w:t xml:space="preserve">• Acceptance Criteria: </w:t>
+        <w:t>Priority:</w:t>
       </w:r>
       <w:r>
-        <w:t>Users can define recurring weekly time slots and receive match notifications for overlapping routes within a ±15-minute departure window.</w:t>
-        <w:br/>
+        <w:t xml:space="preserve"> High</w:t>
       </w:r>
+    </w:p>
+    <w:p>
+      <w:pPr>
+        <w:pStyle w:val="ListBullet"/>
+      </w:pPr>
+      <w:r/>
       <w:r>
         <w:rPr>
           <w:b/>
         </w:rPr>
-        <w:t xml:space="preserve">• Rationale: </w:t>
+        <w:t>Acceptance Criteria:</w:t>
       </w:r>
       <w:r>
-        <w:t>Enables regular daily commuters to establish consistent peer-to-peer carpooling routines without re-entering trip details daily.</w:t>
+        <w:t xml:space="preserve"> Users can define recurring weekly time slots and receive match notifications for overlapping routes within a $\pm$15-minute departure window.</w:t>
       </w:r>
     </w:p>
     <w:p>
       <w:pPr>
-        <w:pStyle w:val="Heading3"/>
+        <w:pStyle w:val="ListBullet"/>
       </w:pPr>
+      <w:r/>
       <w:r>
         <w:rPr>
-          <w:color w:val="202124"/>
+          <w:b/>
         </w:rPr>
-        <w:t>FR-004: Require driver hosts to submit valid driving licen...</w:t>
+        <w:t>Rationale:</w:t>
+      </w:r>
+      <w:r>
+        <w:t xml:space="preserve"> Enables regular daily commuters to establish consistent peer-to-peer carpooling routines without re-entering trip details every day.</w:t>
       </w:r>
     </w:p>
     <w:p>
       <w:r>
-        <w:rPr>
-          <w:b/>
-        </w:rPr>
-        <w:t xml:space="preserve">• Req ID: </w:t>
+        <w:t>##### FR-004: Driver Host License &amp; Vehicle Verification</w:t>
       </w:r>
-      <w:r>
-        <w:t>FR-004</w:t>
-        <w:br/>
-      </w:r>
+    </w:p>
+    <w:p>
+      <w:pPr>
+        <w:pStyle w:val="ListBullet"/>
+      </w:pPr>
+      <w:r/>
       <w:r>
         <w:rPr>
           <w:b/>
         </w:rPr>
-        <w:t xml:space="preserve">• Type: </w:t>
+        <w:t>ID:</w:t>
       </w:r>
       <w:r>
-        <w:t>Functional</w:t>
-        <w:br/>
+        <w:t xml:space="preserve"> FR-004</w:t>
       </w:r>
+    </w:p>
+    <w:p>
+      <w:pPr>
+        <w:pStyle w:val="ListBullet"/>
+      </w:pPr>
+      <w:r/>
       <w:r>
         <w:rPr>
           <w:b/>
         </w:rPr>
-        <w:t xml:space="preserve">• Description: </w:t>
+        <w:t>Type:</w:t>
       </w:r>
       <w:r>
-        <w:t>The system shall require Driver Hosts to submit valid driving licenses and vehicle registration documents for verification before publishing ride offers.</w:t>
-        <w:br/>
+        <w:t xml:space="preserve"> Functional</w:t>
       </w:r>
+    </w:p>
+    <w:p>
+      <w:pPr>
+        <w:pStyle w:val="ListBullet"/>
+      </w:pPr>
+      <w:r/>
       <w:r>
         <w:rPr>
           <w:b/>
         </w:rPr>
-        <w:t xml:space="preserve">• Priority: </w:t>
+        <w:t>Description:</w:t>
       </w:r>
       <w:r>
-        <w:t>High</w:t>
-        <w:br/>
+        <w:t xml:space="preserve"> The system shall require Driver Hosts to submit valid driving licenses and vehicle registration documents for verification before publishing ride offers.</w:t>
       </w:r>
+    </w:p>
+    <w:p>
+      <w:pPr>
+        <w:pStyle w:val="ListBullet"/>
+      </w:pPr>
+      <w:r/>
       <w:r>
         <w:rPr>
           <w:b/>
         </w:rPr>
-        <w:t xml:space="preserve">• Acceptance Criteria: </w:t>
+        <w:t>Priority:</w:t>
       </w:r>
       <w:r>
-        <w:t>Unverified driver accounts are prevented from posting ride offers until document verification status is approved by the system or administrator.</w:t>
-        <w:br/>
+        <w:t xml:space="preserve"> High</w:t>
       </w:r>
+    </w:p>
+    <w:p>
+      <w:pPr>
+        <w:pStyle w:val="ListBullet"/>
+      </w:pPr>
+      <w:r/>
       <w:r>
         <w:rPr>
           <w:b/>
         </w:rPr>
-        <w:t xml:space="preserve">• Rationale: </w:t>
+        <w:t>Acceptance Criteria:</w:t>
       </w:r>
       <w:r>
-        <w:t>Establishes baseline safety, trust, and accountability among peer-to-peer carpool participants.</w:t>
+        <w:t xml:space="preserve"> Unverified driver accounts are prevented from posting ride offers until document verification status is approved by the system or administrator.</w:t>
       </w:r>
     </w:p>
     <w:p>
       <w:pPr>
-        <w:pStyle w:val="Heading3"/>
+        <w:pStyle w:val="ListBullet"/>
       </w:pPr>
+      <w:r/>
       <w:r>
         <w:rPr>
-          <w:color w:val="202124"/>
+          <w:b/>
         </w:rPr>
-        <w:t>FR-005: Allow a rider commuter to send a ride request to a...</w:t>
+        <w:t>Rationale:</w:t>
+      </w:r>
+      <w:r>
+        <w:t xml:space="preserve"> Establishes baseline safety, trust, and accountability among peer-to-peer carpool participants.</w:t>
       </w:r>
     </w:p>
     <w:p>
       <w:r>
-        <w:rPr>
-          <w:b/>
-        </w:rPr>
-        <w:t xml:space="preserve">• Req ID: </w:t>
+        <w:t>##### FR-005: Peer-to-Peer Ride Request &amp; Confirmation Flow</w:t>
       </w:r>
-      <w:r>
-        <w:t>FR-005</w:t>
-        <w:br/>
-      </w:r>
+    </w:p>
+    <w:p>
+      <w:pPr>
+        <w:pStyle w:val="ListBullet"/>
+      </w:pPr>
+      <w:r/>
       <w:r>
         <w:rPr>
           <w:b/>
         </w:rPr>
-        <w:t xml:space="preserve">• Type: </w:t>
+        <w:t>ID:</w:t>
       </w:r>
       <w:r>
-        <w:t>Functional</w:t>
-        <w:br/>
+        <w:t xml:space="preserve"> FR-005</w:t>
       </w:r>
+    </w:p>
+    <w:p>
+      <w:pPr>
+        <w:pStyle w:val="ListBullet"/>
+      </w:pPr>
+      <w:r/>
       <w:r>
         <w:rPr>
           <w:b/>
         </w:rPr>
-        <w:t xml:space="preserve">• Description: </w:t>
+        <w:t>Type:</w:t>
       </w:r>
       <w:r>
-        <w:t>The system shall allow a Rider Commuter to send a ride request to a Driver Host for a compatible route and notify both parties upon acceptance or rejection.</w:t>
-        <w:br/>
+        <w:t xml:space="preserve"> Functional</w:t>
       </w:r>
+    </w:p>
+    <w:p>
+      <w:pPr>
+        <w:pStyle w:val="ListBullet"/>
+      </w:pPr>
+      <w:r/>
       <w:r>
         <w:rPr>
           <w:b/>
         </w:rPr>
-        <w:t xml:space="preserve">• Priority: </w:t>
+        <w:t>Description:</w:t>
       </w:r>
       <w:r>
-        <w:t>Medium</w:t>
-        <w:br/>
+        <w:t xml:space="preserve"> The system shall allow a Rider Commuter to send a ride request to a Driver Host for a compatible route and notify both parties upon acceptance or rejection.</w:t>
       </w:r>
+    </w:p>
+    <w:p>
+      <w:pPr>
+        <w:pStyle w:val="ListBullet"/>
+      </w:pPr>
+      <w:r/>
       <w:r>
         <w:rPr>
           <w:b/>
         </w:rPr>
-        <w:t xml:space="preserve">• Acceptance Criteria: </w:t>
+        <w:t>Priority:</w:t>
       </w:r>
       <w:r>
-        <w:t>Driver Hosts receive real-time notifications of ride requests and can accept or decline within a 30-minute window, updating seat availability automatically.</w:t>
-        <w:br/>
+        <w:t xml:space="preserve"> Medium</w:t>
       </w:r>
+    </w:p>
+    <w:p>
+      <w:pPr>
+        <w:pStyle w:val="ListBullet"/>
+      </w:pPr>
+      <w:r/>
       <w:r>
         <w:rPr>
           <w:b/>
         </w:rPr>
-        <w:t xml:space="preserve">• Rationale: </w:t>
+        <w:t>Acceptance Criteria:</w:t>
       </w:r>
       <w:r>
-        <w:t>Facilitates direct peer-to-peer agreement and prevents overbooking of available vehicle seats.</w:t>
+        <w:t xml:space="preserve"> Driver Hosts receive real-time notifications of ride requests and can accept or decline within a 30-minute window, updating seat availability automatically.</w:t>
       </w:r>
     </w:p>
     <w:p>
       <w:pPr>
-        <w:pStyle w:val="Heading3"/>
+        <w:pStyle w:val="ListBullet"/>
+      </w:pPr>
+      <w:r/>
+      <w:r>
+        <w:rPr>
+          <w:b/>
+        </w:rPr>
+        <w:t>Rationale:</w:t>
+      </w:r>
+      <w:r>
+        <w:t xml:space="preserve"> Facilitates direct peer-to-peer agreement and prevents double booking of available vehicle seats.</w:t>
+      </w:r>
+    </w:p>
+    <w:p>
+      <w:pPr>
+        <w:pStyle w:val="Heading4"/>
       </w:pPr>
       <w:r>
-        <w:rPr>
-          <w:color w:val="202124"/>
-        </w:rPr>
-        <w:t>NFR-001: Be stored securely with encrypted backups....</w:t>
+        <w:t>Non-Functional Requirements</w:t>
       </w:r>
     </w:p>
     <w:p>
       <w:r>
-        <w:rPr>
-          <w:b/>
-        </w:rPr>
-        <w:t xml:space="preserve">• Req ID: </w:t>
+        <w:t>##### NFR-001: Data Encryption &amp; Secure Backup Storage</w:t>
       </w:r>
-      <w:r>
-        <w:t>NFR-001</w:t>
-        <w:br/>
-      </w:r>
+    </w:p>
+    <w:p>
+      <w:pPr>
+        <w:pStyle w:val="ListBullet"/>
+      </w:pPr>
+      <w:r/>
       <w:r>
         <w:rPr>
           <w:b/>
         </w:rPr>
-        <w:t xml:space="preserve">• Type: </w:t>
+        <w:t>ID:</w:t>
       </w:r>
       <w:r>
-        <w:t>Non-Functional</w:t>
-        <w:br/>
+        <w:t xml:space="preserve"> NFR-001</w:t>
       </w:r>
+    </w:p>
+    <w:p>
+      <w:pPr>
+        <w:pStyle w:val="ListBullet"/>
+      </w:pPr>
+      <w:r/>
       <w:r>
         <w:rPr>
           <w:b/>
         </w:rPr>
-        <w:t xml:space="preserve">• Description: </w:t>
+        <w:t>Type:</w:t>
       </w:r>
       <w:r>
-        <w:t>User ratings, driving license verification documents, and travel histories must be stored securely with encrypted backups.</w:t>
-        <w:br/>
+        <w:t xml:space="preserve"> Non-Functional</w:t>
       </w:r>
+    </w:p>
+    <w:p>
+      <w:pPr>
+        <w:pStyle w:val="ListBullet"/>
+      </w:pPr>
+      <w:r/>
       <w:r>
         <w:rPr>
           <w:b/>
         </w:rPr>
-        <w:t xml:space="preserve">• Priority: </w:t>
+        <w:t>Description:</w:t>
       </w:r>
       <w:r>
-        <w:t>High</w:t>
-        <w:br/>
+        <w:t xml:space="preserve"> User ratings, driving license verification documents, and travel histories must be stored securely with encrypted backups.</w:t>
       </w:r>
+    </w:p>
+    <w:p>
+      <w:pPr>
+        <w:pStyle w:val="ListBullet"/>
+      </w:pPr>
+      <w:r/>
       <w:r>
         <w:rPr>
           <w:b/>
         </w:rPr>
-        <w:t xml:space="preserve">• Acceptance Criteria: </w:t>
+        <w:t>Priority:</w:t>
       </w:r>
       <w:r>
-        <w:t>Sensitive verification documents and travel logs are encrypted at rest using AES-256 and in transit using TLS 1.3, with automated daily encrypted backups.</w:t>
-        <w:br/>
+        <w:t xml:space="preserve"> High</w:t>
       </w:r>
+    </w:p>
+    <w:p>
+      <w:pPr>
+        <w:pStyle w:val="ListBullet"/>
+      </w:pPr>
+      <w:r/>
       <w:r>
         <w:rPr>
           <w:b/>
         </w:rPr>
-        <w:t xml:space="preserve">• Rationale: </w:t>
+        <w:t>Acceptance Criteria:</w:t>
       </w:r>
       <w:r>
-        <w:t>Protects personally identifiable information (PII) and legal verification documents from data breaches and unauthorized access in compliance with privacy standards.</w:t>
+        <w:t xml:space="preserve"> Sensitive verification documents and travel logs are encrypted at rest using AES-256 and in transit using TLS 1.3, with automated daily encrypted backups.</w:t>
       </w:r>
     </w:p>
     <w:p>
       <w:pPr>
-        <w:pStyle w:val="Heading3"/>
+        <w:pStyle w:val="ListBullet"/>
       </w:pPr>
+      <w:r/>
       <w:r>
         <w:rPr>
-          <w:color w:val="202124"/>
+          <w:b/>
         </w:rPr>
-        <w:t>NFR-002: Compute route matching and detour tolerance calcul...</w:t>
+        <w:t>Rationale:</w:t>
+      </w:r>
+      <w:r>
+        <w:t xml:space="preserve"> Protects personally identifiable information (PII) and legal verification documents from data breaches and unauthorized access in compliance with privacy standards.</w:t>
       </w:r>
     </w:p>
     <w:p>
       <w:r>
-        <w:rPr>
-          <w:b/>
-        </w:rPr>
-        <w:t xml:space="preserve">• Req ID: </w:t>
+        <w:t>##### NFR-002: Real-time Route Matching Performance</w:t>
       </w:r>
-      <w:r>
-        <w:t>NFR-002</w:t>
-        <w:br/>
-      </w:r>
+    </w:p>
+    <w:p>
+      <w:pPr>
+        <w:pStyle w:val="ListBullet"/>
+      </w:pPr>
+      <w:r/>
       <w:r>
         <w:rPr>
           <w:b/>
         </w:rPr>
-        <w:t xml:space="preserve">• Type: </w:t>
+        <w:t>ID:</w:t>
       </w:r>
       <w:r>
-        <w:t>Non-Functional</w:t>
-        <w:br/>
+        <w:t xml:space="preserve"> NFR-002</w:t>
       </w:r>
+    </w:p>
+    <w:p>
+      <w:pPr>
+        <w:pStyle w:val="ListBullet"/>
+      </w:pPr>
+      <w:r/>
       <w:r>
         <w:rPr>
           <w:b/>
         </w:rPr>
-        <w:t xml:space="preserve">• Description: </w:t>
+        <w:t>Type:</w:t>
       </w:r>
       <w:r>
-        <w:t>The system shall compute route matching and detour tolerance calculations for incoming ride search queries within 2 seconds under a concurrent load of up to 1,000 active queries.</w:t>
-        <w:br/>
+        <w:t xml:space="preserve"> Non-Functional</w:t>
       </w:r>
+    </w:p>
+    <w:p>
+      <w:pPr>
+        <w:pStyle w:val="ListBullet"/>
+      </w:pPr>
+      <w:r/>
       <w:r>
         <w:rPr>
           <w:b/>
         </w:rPr>
-        <w:t xml:space="preserve">• Priority: </w:t>
+        <w:t>Description:</w:t>
       </w:r>
       <w:r>
-        <w:t>High</w:t>
-        <w:br/>
+        <w:t xml:space="preserve"> The system shall compute route matching and detour tolerance calculations for incoming ride search queries within 2 seconds under a concurrent load of up to 1,000 active queries.</w:t>
       </w:r>
+    </w:p>
+    <w:p>
+      <w:pPr>
+        <w:pStyle w:val="ListBullet"/>
+      </w:pPr>
+      <w:r/>
       <w:r>
         <w:rPr>
           <w:b/>
         </w:rPr>
-        <w:t xml:space="preserve">• Acceptance Criteria: </w:t>
+        <w:t>Priority:</w:t>
       </w:r>
       <w:r>
-        <w:t>95% of route search queries return sorted match results within 2,000 milliseconds during stress testing at peak simulated load.</w:t>
-        <w:br/>
+        <w:t xml:space="preserve"> High</w:t>
       </w:r>
+    </w:p>
+    <w:p>
+      <w:pPr>
+        <w:pStyle w:val="ListBullet"/>
+      </w:pPr>
+      <w:r/>
       <w:r>
         <w:rPr>
           <w:b/>
         </w:rPr>
-        <w:t xml:space="preserve">• Rationale: </w:t>
+        <w:t>Acceptance Criteria:</w:t>
       </w:r>
       <w:r>
-        <w:t>Ensures a responsive user experience so commuters can quickly evaluate matching rides during peak rush-hour usage.</w:t>
+        <w:t xml:space="preserve"> 95% of route search queries return sorted match results within 2,000 milliseconds during stress testing at peak simulated load.</w:t>
+      </w:r>
+    </w:p>
+    <w:p>
+      <w:pPr>
+        <w:pStyle w:val="ListBullet"/>
+      </w:pPr>
+      <w:r/>
+      <w:r>
+        <w:rPr>
+          <w:b/>
+        </w:rPr>
+        <w:t>Rationale:</w:t>
+      </w:r>
+      <w:r>
+        <w:t xml:space="preserve"> Ensures a responsive user experience so commuters can quickly evaluate matching rides during peak rush-hour usage.</w:t>
       </w:r>
     </w:p>
     <w:sectPr>
@@ -1759,7 +1710,7 @@
       <w:rFonts w:asciiTheme="majorHAnsi" w:eastAsiaTheme="majorEastAsia" w:hAnsiTheme="majorHAnsi" w:cstheme="majorBidi"/>
       <w:b/>
       <w:bCs/>
-      <w:color w:val="365F91" w:themeColor="accent1" w:themeShade="BF"/>
+      <w:color w:val="1A73E8"/>
       <w:sz w:val="28"/>
       <w:szCs w:val="28"/>
     </w:rPr>
@@ -1783,7 +1734,7 @@
       <w:rFonts w:asciiTheme="majorHAnsi" w:eastAsiaTheme="majorEastAsia" w:hAnsiTheme="majorHAnsi" w:cstheme="majorBidi"/>
       <w:b/>
       <w:bCs/>
-      <w:color w:val="4F81BD" w:themeColor="accent1"/>
+      <w:color w:val="1A73E8"/>
       <w:sz w:val="26"/>
       <w:szCs w:val="26"/>
     </w:rPr>
@@ -1807,7 +1758,7 @@
       <w:rFonts w:asciiTheme="majorHAnsi" w:eastAsiaTheme="majorEastAsia" w:hAnsiTheme="majorHAnsi" w:cstheme="majorBidi"/>
       <w:b/>
       <w:bCs/>
-      <w:color w:val="4F81BD" w:themeColor="accent1"/>
+      <w:color w:val="202124"/>
     </w:rPr>
   </w:style>
   <w:style w:type="paragraph" w:styleId="Heading4">
@@ -1832,7 +1783,7 @@
       <w:bCs/>
       <w:i/>
       <w:iCs/>
-      <w:color w:val="4F81BD" w:themeColor="accent1"/>
+      <w:color w:val="3C4043"/>
     </w:rPr>
   </w:style>
   <w:style w:type="paragraph" w:styleId="Heading5">

</xml_diff>